<commit_message>
fix(psychopathologie): corrige la leçon 17 et durcit le prompt — le PDF du Flash HAS lu et lié (constipation, fausse route, Dépister), 1/3 avec ses 60 événements, syndrome malin rendu aux antipsychotiques, DCI recopiées ; B3 bis, A2 ter, C2 ter et une étape 5 bis à quatre motifs (validée dans les deux sens)
Co-Authored-By: Claude Opus 5 <noreply@anthropic.com>
</commit_message>
<xml_diff>
--- a/livrables/lecons/2026-09-21_lecon-psychopathologie_17_psychotropes-classes-effets-surveillance.docx
+++ b/livrables/lecons/2026-09-21_lecon-psychopathologie_17_psychotropes-classes-effets-surveillance.docx
@@ -200,7 +200,18 @@
           <w:sz w:val="22"/>
           <w:szCs w:val="22"/>
         </w:rPr>
-        <w:t xml:space="preserve">Quatre sous-classes sont reconnues (ANSM, mis à jour 18/09/2026) :</w:t>
+        <w:t xml:space="preserve">Cinq groupes sont décrits par l'ANSM (page mise à jour le 18/09/2026) :</w:t>
+      </w:r>
+      <w:r>
+        <w:rPr>
+          <w:rFonts w:ascii="Times New Roman" w:cs="Times New Roman" w:eastAsia="Times New Roman" w:hAnsi="Times New Roman"/>
+          <w:i/>
+          <w:iCs/>
+          <w:color w:val="6B7280"/>
+          <w:sz w:val="20"/>
+          <w:szCs w:val="20"/>
+        </w:rPr>
+        <w:t xml:space="preserve"> [Corrigé le 21/09/2026 : l'ANSM décrit cinq groupes ; la leçon en présentait quatre sous « quatre sous-classes sont reconnues (ANSM) ». Ligne ajoutée au tableau.]</w:t>
       </w:r>
     </w:p>
     <w:tbl>
@@ -393,6 +404,40 @@
           </w:p>
         </w:tc>
       </w:tr>
+      <w:tr>
+        <w:tc>
+          <w:tcPr>
+            <w:shd w:fill="FFFFFF" w:color="auto" w:val="clear"/>
+          </w:tcPr>
+          <w:p>
+            <w:r>
+              <w:rPr>
+                <w:rFonts w:ascii="Times New Roman" w:cs="Times New Roman" w:eastAsia="Times New Roman" w:hAnsi="Times New Roman"/>
+                <w:color w:val="1F2937"/>
+                <w:sz w:val="20"/>
+                <w:szCs w:val="20"/>
+              </w:rPr>
+              <w:t xml:space="preserve">Autres antidépresseurs</w:t>
+            </w:r>
+          </w:p>
+        </w:tc>
+        <w:tc>
+          <w:tcPr>
+            <w:shd w:fill="FFFFFF" w:color="auto" w:val="clear"/>
+          </w:tcPr>
+          <w:p>
+            <w:r>
+              <w:rPr>
+                <w:rFonts w:ascii="Times New Roman" w:cs="Times New Roman" w:eastAsia="Times New Roman" w:hAnsi="Times New Roman"/>
+                <w:color w:val="1F2937"/>
+                <w:sz w:val="20"/>
+                <w:szCs w:val="20"/>
+              </w:rPr>
+              <w:t xml:space="preserve">Agomélatine, Eskétamine, Miansérine, Mirtazapine, Tianeptine, Vortioxétine — mécanismes variés, utilisés en cas de résistance ou d'intolérance aux autres traitements (ANSM)</w:t>
+            </w:r>
+          </w:p>
+        </w:tc>
+      </w:tr>
     </w:tbl>
     <w:p>
       <w:pPr>
@@ -424,7 +469,18 @@
           <w:sz w:val="22"/>
           <w:szCs w:val="22"/>
         </w:rPr>
-        <w:t xml:space="preserve">Effets indésirables à connaître : un syndrome de discontinuation peut survenir en cas d'arrêt brutal — vertiges, troubles du sommeil, irritabilité, symptômes pseudo-grippaux. L'arrêt doit se faire progressivement sous supervision médicale.</w:t>
+        <w:t xml:space="preserve">Effets indésirables à connaître : un syndrome de sevrage peut survenir en cas d'arrêt brutal — vertiges ou troubles de l'équilibre, troubles du sommeil, irritabilité ou anxiété, symptômes pseudo-grippaux (ANSM, 18/09/2026). L'arrêt doit se faire progressivement sous supervision médicale. L'ANSM précise sur la même page que « contrairement aux anxiolytiques ou aux hypnotiques (somnifères), la grande majorité des antidépresseurs ne créent pas de dépendance ». </w:t>
+      </w:r>
+      <w:r>
+        <w:rPr>
+          <w:rFonts w:ascii="Times New Roman" w:cs="Times New Roman" w:eastAsia="Times New Roman" w:hAnsi="Times New Roman"/>
+          <w:i/>
+          <w:iCs/>
+          <w:color w:val="6B7280"/>
+          <w:sz w:val="20"/>
+          <w:szCs w:val="20"/>
+        </w:rPr>
+        <w:t xml:space="preserve">[Corrigé le 21/09/2026 : « syndrome de discontinuation » remplacé par le terme de la page, et la phrase de l'ANSM sur la dépendance ajoutée — elle est la seule source de la leçon sur ce point pour les anxiolytiques.]</w:t>
       </w:r>
     </w:p>
     <w:p>
@@ -544,7 +600,7 @@
                 <w:szCs w:val="20"/>
               </w:rPr>
               <w:t xml:space="preserve">1ère génération (typiques)
-Ex. : Chlorpromazine, Halopéridol, Lévopromazine</w:t>
+Ex. : Chlorpromazine, Halopéridol, Lévomépromazine</w:t>
             </w:r>
           </w:p>
         </w:tc>
@@ -560,7 +616,7 @@
                 <w:sz w:val="20"/>
                 <w:szCs w:val="20"/>
               </w:rPr>
-              <w:t xml:space="preserve">Efficaces sur les symptômes dits positifs (hallucinations, délires) ; risque neurologique plus élevé : syndrome parkinsonien, dyskinésies tardives</w:t>
+              <w:t xml:space="preserve">Efficaces sur les symptômes dits positifs (hallucinations, délires) ; risque neurologique plus élevé : syndrome parkinsonien, dyskinésies</w:t>
             </w:r>
           </w:p>
         </w:tc>
@@ -698,6 +754,66 @@
     </w:p>
     <w:p>
       <w:pPr>
+        <w:pStyle w:val="ListParagraph"/>
+        <w:numPr>
+          <w:ilvl w:val="0"/>
+          <w:numId w:val="1"/>
+        </w:numPr>
+        <w:spacing w:after="40" w:before="40"/>
+      </w:pPr>
+      <w:r>
+        <w:rPr>
+          <w:rFonts w:ascii="Times New Roman" w:cs="Times New Roman" w:eastAsia="Times New Roman" w:hAnsi="Times New Roman"/>
+          <w:color w:val="1F2937"/>
+          <w:sz w:val="22"/>
+          <w:szCs w:val="22"/>
+        </w:rPr>
+        <w:t xml:space="preserve">Constipation, pouvant aller jusqu'à l'occlusion intestinale — surveillance du transit, en particulier sous clozapine ; toute douleur abdominale ou ventre distendu se transmet le jour même (HAS, Flash Sécurité Patient, PDF du 27/10/2022 : deux de ses trois événements sont des occlusions mortelles sous clozapine). </w:t>
+      </w:r>
+      <w:r>
+        <w:rPr>
+          <w:rFonts w:ascii="Times New Roman" w:cs="Times New Roman" w:eastAsia="Times New Roman" w:hAnsi="Times New Roman"/>
+          <w:i/>
+          <w:iCs/>
+          <w:color w:val="6B7280"/>
+          <w:sz w:val="20"/>
+          <w:szCs w:val="20"/>
+        </w:rPr>
+        <w:t xml:space="preserve">[Corrigé le 21/09/2026 : absent de la liste livrée, alors que c'est le premier risque que le document cité décrit.]</w:t>
+      </w:r>
+    </w:p>
+    <w:p>
+      <w:pPr>
+        <w:pStyle w:val="ListParagraph"/>
+        <w:numPr>
+          <w:ilvl w:val="0"/>
+          <w:numId w:val="1"/>
+        </w:numPr>
+        <w:spacing w:after="40" w:before="40"/>
+      </w:pPr>
+      <w:r>
+        <w:rPr>
+          <w:rFonts w:ascii="Times New Roman" w:cs="Times New Roman" w:eastAsia="Times New Roman" w:hAnsi="Times New Roman"/>
+          <w:color w:val="1F2937"/>
+          <w:sz w:val="22"/>
+          <w:szCs w:val="22"/>
+        </w:rPr>
+        <w:t xml:space="preserve">Troubles de la déglutition et fausse route au repas — surveillance des repas, textures adaptées si besoin (HAS, même Flash : troisième événement, un patient de plus de 70 ans en USLD mort d'une fausse route sans surveillance au repas). </w:t>
+      </w:r>
+      <w:r>
+        <w:rPr>
+          <w:rFonts w:ascii="Times New Roman" w:cs="Times New Roman" w:eastAsia="Times New Roman" w:hAnsi="Times New Roman"/>
+          <w:i/>
+          <w:iCs/>
+          <w:color w:val="6B7280"/>
+          <w:sz w:val="20"/>
+          <w:szCs w:val="20"/>
+        </w:rPr>
+        <w:t xml:space="preserve">[Corrigé le 21/09/2026 : absent de la liste livrée.]</w:t>
+      </w:r>
+    </w:p>
+    <w:p>
+      <w:pPr>
         <w:spacing w:after="80" w:before="80"/>
       </w:pPr>
     </w:p>
@@ -716,7 +832,18 @@
           <w:sz w:val="22"/>
           <w:szCs w:val="22"/>
         </w:rPr>
-        <w:t xml:space="preserve">La page HAS indique que parmi les événements graves médicamenteux liés à un mésusage de neuroleptiques, 1/3 sont liés à une absence d'évaluation régulière du traitement (HAS, Flash Sécurité Patient, validé octobre 2022).</w:t>
+        <w:t xml:space="preserve">La page HAS indique que parmi les 60 événements graves médicamenteux liés à un mésusage de neuroleptiques analysés dans sa base REX-EIGS, 1/3 — une vingtaine de cas — sont liés à une absence d'évaluation régulière du traitement (HAS, Flash Sécurité Patient, daté du 27 octobre 2022, mis en ligne le 3 novembre 2022).</w:t>
+      </w:r>
+      <w:r>
+        <w:rPr>
+          <w:rFonts w:ascii="Times New Roman" w:cs="Times New Roman" w:eastAsia="Times New Roman" w:hAnsi="Times New Roman"/>
+          <w:i/>
+          <w:iCs/>
+          <w:color w:val="6B7280"/>
+          <w:sz w:val="20"/>
+          <w:szCs w:val="20"/>
+        </w:rPr>
+        <w:t xml:space="preserve"> [Corrigé le 21/09/2026 : le dénominateur (60 signalements) et la nature des cas (mésusage, base de retour d'expérience) manquaient : ce n'est pas un tiers des événements graves sous neuroleptiques.]</w:t>
       </w:r>
     </w:p>
     <w:p>
@@ -746,6 +873,17 @@
           <w:t xml:space="preserve">HAS — Flash Sécurité Patient « Patient sous neuroleptique. La vigilance est la bonne pratique » (validé octobre 2022, en ligne novembre 2022)</w:t>
         </w:r>
       </w:hyperlink>
+      <w:r>
+        <w:rPr>
+          <w:rFonts w:ascii="Times New Roman" w:cs="Times New Roman" w:eastAsia="Times New Roman" w:hAnsi="Times New Roman"/>
+          <w:i/>
+          <w:iCs/>
+          <w:color w:val="6B7280"/>
+          <w:sz w:val="20"/>
+          <w:szCs w:val="20"/>
+        </w:rPr>
+        <w:t xml:space="preserve"> — page de présentation ; le document lui-même est le PDF de trois pages lié sur cette page (ressources, ci-dessous). [Corrigé le 21/09/2026 : la leçon citait la page, pas le document.]</w:t>
+      </w:r>
     </w:p>
     <w:p>
       <w:pPr>
@@ -1177,7 +1315,7 @@
           <w:sz w:val="22"/>
           <w:szCs w:val="22"/>
         </w:rPr>
-        <w:t xml:space="preserve">Médicaments (ANSM, mis à jour 12/08/2026) : Méthylphénidate (Concerta, Médikinet, Quasym, Ritaline) — Lisdexamphétamine (Xurta).</w:t>
+        <w:t xml:space="preserve">Médicaments (ANSM, mis à jour 12/08/2026) : Méthylphénidate (Concerta, Médikinet, Quasym, Ritaline) — Lisdexamfétamine (Xurta).</w:t>
       </w:r>
     </w:p>
     <w:p>
@@ -1330,7 +1468,18 @@
           <w:sz w:val="22"/>
           <w:szCs w:val="22"/>
         </w:rPr>
-        <w:t xml:space="preserve">La HAS, dans son Flash Sécurité Patient de 2022, propose quatre actions préventives pour tout professionnel côtoyant des patients sous neuroleptiques (applicable par analogie à tout accompagnement de personnes sous psychotropes) :</w:t>
+        <w:t xml:space="preserve">La HAS, dans son Flash Sécurité Patient de 2022, écrit que la prise en charge des patients sous neuroleptique « s'articule autour de 4 actions de prévention : Informer, Dépister, Surveiller, Sensibiliser ». Le document s'adresse aux professionnels de santé et aux équipes de soin ; la colonne de droite dit ce que la HAS met sous chaque action, puis ce qu'une équipe éducative peut en transposer — cette transposition est celle de la leçon, pas celle de la HAS. </w:t>
+      </w:r>
+      <w:r>
+        <w:rPr>
+          <w:rFonts w:ascii="Times New Roman" w:cs="Times New Roman" w:eastAsia="Times New Roman" w:hAnsi="Times New Roman"/>
+          <w:i/>
+          <w:iCs/>
+          <w:color w:val="6B7280"/>
+          <w:sz w:val="20"/>
+          <w:szCs w:val="20"/>
+        </w:rPr>
+        <w:t xml:space="preserve">[Corrigé le 21/09/2026 : « propose quatre actions préventives pour tout professionnel côtoyant des patients sous neuroleptiques » élargissait le destinataire, « Détecter » remplaçait « Dépister », et la colonne pratique portait le contenu de la leçon sous le titre (HAS, 2022).]</w:t>
       </w:r>
     </w:p>
     <w:tbl>
@@ -1382,7 +1531,7 @@
                 <w:sz w:val="20"/>
                 <w:szCs w:val="20"/>
               </w:rPr>
-              <w:t xml:space="preserve">Ce que cela signifie en pratique</w:t>
+              <w:t xml:space="preserve">Ce que la HAS y met (Flash, PDF) — et sa transposition en ESSMS</w:t>
             </w:r>
           </w:p>
         </w:tc>
@@ -1416,7 +1565,7 @@
                 <w:sz w:val="20"/>
                 <w:szCs w:val="20"/>
               </w:rPr>
-              <w:t xml:space="preserve">La personne accompagnée connaît les effets attendus et les signes à signaler</w:t>
+              <w:t xml:space="preserve">HAS : information du patient et de son entourage sur le bon usage et les effets secondaires qui doivent faire consulter rapidement — constipation sévère, diarrhée inexpliquée, douleurs abdominales, vomissements, difficultés à respirer. En ESSMS : la personne et l'équipe connaissent ces signes.</w:t>
             </w:r>
           </w:p>
         </w:tc>
@@ -1434,7 +1583,7 @@
                 <w:sz w:val="20"/>
                 <w:szCs w:val="20"/>
               </w:rPr>
-              <w:t xml:space="preserve">2. Détecter</w:t>
+              <w:t xml:space="preserve">2. Dépister</w:t>
             </w:r>
           </w:p>
         </w:tc>
@@ -1450,7 +1599,7 @@
                 <w:sz w:val="20"/>
                 <w:szCs w:val="20"/>
               </w:rPr>
-              <w:t xml:space="preserve">Repérer précocement les effets indésirables (tremblements, agitation, prise de poids, troubles du sommeil, etc.)</w:t>
+              <w:t xml:space="preserve">HAS : facteurs de risque avant toute prescription, interactions (métabolisme glucidique et lipidique), non-observance ou arrêt brutal, tout changement de comportement ou syndrome douloureux abdominal. En ESSMS : signaler non-observance, changement de comportement, plainte abdominale.</w:t>
             </w:r>
           </w:p>
         </w:tc>
@@ -1484,7 +1633,7 @@
                 <w:sz w:val="20"/>
                 <w:szCs w:val="20"/>
               </w:rPr>
-              <w:t xml:space="preserve">Évaluation régulière du traitement — ne pas supposer que « ça va » parce que la personne ne se plaint pas</w:t>
+              <w:t xml:space="preserve">HAS : effets neurologiques, métaboliques (poids, périmètre abdominal), neurovégétatifs (constipation, sécheresse buccale), biologiques (glycémie, lipides), cardio-vasculaires (TA, ECG), par des examens cliniques répétés et une réévaluation des traitements. En ESSMS : poids, transit, repas, tremblements — consignés et datés ; ne pas supposer que « ça va » parce que la personne ne se plaint pas.</w:t>
             </w:r>
           </w:p>
         </w:tc>
@@ -1518,7 +1667,7 @@
                 <w:sz w:val="20"/>
                 <w:szCs w:val="20"/>
               </w:rPr>
-              <w:t xml:space="preserve">Former l'équipe éducative aux signes d'alerte nécessitant une consultation médicale urgente</w:t>
+              <w:t xml:space="preserve">HAS : sensibilisation et formation des professionnels de santé aux risques encourus, et vigilance sur le biais qui met toute symptomatologie sur le compte de la maladie psychiatrique. En ESSMS : former l'équipe éducative aux signes d'alerte — et à ce biais, l'overshadowing de la leçon 16.</w:t>
             </w:r>
           </w:p>
         </w:tc>
@@ -2309,7 +2458,18 @@
           <w:sz w:val="20"/>
           <w:szCs w:val="20"/>
         </w:rPr>
-        <w:t xml:space="preserve">1. Le tableau — épisode maniaque traité, avec polydipsie (soif intense), hyperphagie et tremblements — oriente vers un THYMORÉGULATEUR, et notamment vers le Lithium, dont ces trois signes constituent des effets indésirables décrits (prise de poids, tremblements) et, pour la soif, un signal d'alerte possible de lithémie (concentration sanguine) trop élevée. Attention : l'identification de la molécule précise relève du médecin. Ce qu'on peut faire : consigner et transmettre.</w:t>
+        <w:t xml:space="preserve">1. Le tableau — épisode maniaque traité, avec polydipsie (soif intense), hyperphagie et tremblements — oriente vers un THYMORÉGULATEUR, et notamment vers le Lithium, dont la prise de poids et les tremblements sont des effets indésirables décrits par l'ANSM (18/09/2026). La soif intense n'est pas sur les pages de cette leçon : règle de prudence, non sourcée ici — une soif ou des urines inhabituelles sous lithium se transmettent au médecin sans attendre, sans en tirer soi-même une conclusion sur le dosage. Attention : l'identification de la molécule précise relève du médecin. Ce qu'on peut faire : consigner et transmettre.</w:t>
+      </w:r>
+      <w:r>
+        <w:rPr>
+          <w:rFonts w:ascii="Times New Roman" w:cs="Times New Roman" w:eastAsia="Times New Roman" w:hAnsi="Times New Roman"/>
+          <w:i/>
+          <w:iCs/>
+          <w:color w:val="6B7280"/>
+          <w:sz w:val="20"/>
+          <w:szCs w:val="20"/>
+        </w:rPr>
+        <w:t xml:space="preserve"> [Corrigé le 21/09/2026 : la soif était présentée comme « un signal d'alerte possible de lithémie trop élevée » — affirmation sans source dans la leçon, écrite comme un fait ; ramenée à une règle de prudence déclarée.]</w:t>
       </w:r>
     </w:p>
     <w:p>
@@ -3335,7 +3495,7 @@
                 <w:sz w:val="18"/>
                 <w:szCs w:val="18"/>
               </w:rPr>
-              <w:t xml:space="preserve">Syndrome de discontinuation à l'arrêt ; agitation/irritabilité en début de traitement</w:t>
+              <w:t xml:space="preserve">Syndrome de sevrage à l'arrêt brutal ; effets indésirables surtout en début de traitement ou à l'augmentation des doses (ANSM)</w:t>
             </w:r>
           </w:p>
         </w:tc>
@@ -3447,7 +3607,7 @@
                 <w:sz w:val="18"/>
                 <w:szCs w:val="18"/>
               </w:rPr>
-              <w:t xml:space="preserve">Syndrome extrapyramidal (tremblements, rigidité) ; prise de poids / syndrome métabolique</w:t>
+              <w:t xml:space="preserve">Syndrome extrapyramidal (tremblements, rigidité) ; constipation / fausse route ; prise de poids</w:t>
             </w:r>
           </w:p>
         </w:tc>
@@ -3469,7 +3629,7 @@
                 <w:sz w:val="18"/>
                 <w:szCs w:val="18"/>
               </w:rPr>
-              <w:t xml:space="preserve">Médecin, infirmier (signalement rapide si signes moteurs)</w:t>
+              <w:t xml:space="preserve">Médecin, infirmier (signalement rapide si signes moteurs, transit bloqué ou fausse route ; urgence si fièvre + rigidité + confusion — syndrome malin)</w:t>
             </w:r>
           </w:p>
         </w:tc>
@@ -3581,7 +3741,7 @@
                 <w:sz w:val="18"/>
                 <w:szCs w:val="18"/>
               </w:rPr>
-              <w:t xml:space="preserve">Médecin (urgence si fièvre + rigidité + confusion)</w:t>
+              <w:t xml:space="preserve">Médecin, infirmier (transmission rapide si soif, urines ou tremblements inhabituels)</w:t>
             </w:r>
           </w:p>
         </w:tc>
@@ -3843,7 +4003,18 @@
           <w:sz w:val="22"/>
           <w:szCs w:val="22"/>
         </w:rPr>
-        <w:t xml:space="preserve">La HAS, dans son Flash Sécurité Patient « Patient sous neuroleptique. La vigilance est la bonne pratique » (validé octobre 2022, en ligne novembre 2022), rappelle que 1/3 des événements graves médicamenteux liés aux neuroleptiques sont associés à une absence d'évaluation régulière du traitement. Ce document identifie quatre leviers : informer, détecter, surveiller, sensibiliser.</w:t>
+        <w:t xml:space="preserve">La HAS, dans son Flash Sécurité Patient « Patient sous neuroleptique. La vigilance est la bonne pratique » (daté du 27 octobre 2022, mis en ligne le 3 novembre 2022), analyse 60 événements graves médicamenteux liés à un mésusage de neuroleptiques signalés dans sa base REX-EIGS : un tiers est lié à une absence d'évaluation régulière du traitement. Ses trois événements sont deux occlusions intestinales mortelles sous clozapine et une fausse route mortelle au repas ; ses mots-clés : « neuroleptiques – constipation – fausse route – iatrogénie – occlusion ». Le document articule quatre actions — informer, dépister, surveiller, sensibiliser — et se ferme sur un biais cognitif : mettre toute symptomatologie sur le compte de la maladie psychiatrique. </w:t>
+      </w:r>
+      <w:r>
+        <w:rPr>
+          <w:rFonts w:ascii="Times New Roman" w:cs="Times New Roman" w:eastAsia="Times New Roman" w:hAnsi="Times New Roman"/>
+          <w:i/>
+          <w:iCs/>
+          <w:color w:val="6B7280"/>
+          <w:sz w:val="20"/>
+          <w:szCs w:val="20"/>
+        </w:rPr>
+        <w:t xml:space="preserve">[Corrigé le 21/09/2026 : le pont pro citait « 1/3 des événements graves médicamenteux liés aux neuroleptiques » sans dénominateur ni mésusage, nommait « détecter » pour « dépister », et ne disait rien des trois événements ni des mots-clés du document — le PDF n'avait pas été ouvert.]</w:t>
       </w:r>
     </w:p>
     <w:p>
@@ -3857,7 +4028,7 @@
           <w:sz w:val="22"/>
           <w:szCs w:val="22"/>
         </w:rPr>
-        <w:t xml:space="preserve">En ESSMS, l'équipe éducative est souvent la première à observer un changement comportemental ou physique chez la personne accompagnée — bien avant la consultation médicale suivante. Cette position d'observation privilégiée n'est pas un rôle médical : c'est un rôle d'alerte. Former l'équipe à reconnaître les signes indésirables principaux (tremblements, rigidité, chutes, prise de poids rapide, changements d'humeur) et à les consigner constitue un levier concret pour la qualité et la sécurité de l'accompagnement.</w:t>
+        <w:t xml:space="preserve">En ESSMS, l'équipe éducative est souvent la première à observer un changement comportemental ou physique chez la personne accompagnée — bien avant la consultation médicale suivante. Cette position d'observation privilégiée n'est pas un rôle médical : c'est un rôle d'alerte. Former l'équipe à reconnaître les signes indésirables principaux (tremblements, rigidité, chutes, prise de poids rapide, changements d'humeur — et, sous neuroleptique, le transit qui se bloque et la toux au repas) et à les consigner constitue un levier concret pour la qualité et la sécurité de l'accompagnement.</w:t>
       </w:r>
     </w:p>
     <w:p>
@@ -4067,6 +4238,43 @@
           <w:t xml:space="preserve">HAS — Flash Sécurité Patient « Patient sous neuroleptique. La vigilance est la bonne pratique » (validé octobre 2022, en ligne novembre 2022)</w:t>
         </w:r>
       </w:hyperlink>
+      <w:r>
+        <w:rPr>
+          <w:rFonts w:ascii="Times New Roman" w:cs="Times New Roman" w:eastAsia="Times New Roman" w:hAnsi="Times New Roman"/>
+          <w:i/>
+          <w:iCs/>
+          <w:color w:val="6B7280"/>
+          <w:sz w:val="20"/>
+          <w:szCs w:val="20"/>
+        </w:rPr>
+        <w:t xml:space="preserve"> — page de présentation. [Corrigé le 21/09/2026 : le document lui-même, ci-dessous.]</w:t>
+      </w:r>
+    </w:p>
+    <w:p>
+      <w:pPr>
+        <w:spacing w:after="40" w:before="40"/>
+      </w:pPr>
+      <w:r>
+        <w:rPr>
+          <w:rFonts w:ascii="Times New Roman" w:cs="Times New Roman" w:eastAsia="Times New Roman" w:hAnsi="Times New Roman"/>
+          <w:color w:val="1F2937"/>
+          <w:sz w:val="22"/>
+          <w:szCs w:val="22"/>
+        </w:rPr>
+        <w:t xml:space="preserve">→ </w:t>
+      </w:r>
+      <w:hyperlink w:history="1" r:id="rIdFlashPdf2022">
+        <w:r>
+          <w:rPr>
+            <w:rFonts w:ascii="Times New Roman" w:cs="Times New Roman" w:eastAsia="Times New Roman" w:hAnsi="Times New Roman"/>
+            <w:color w:val="1155CC"/>
+            <w:sz w:val="22"/>
+            <w:szCs w:val="22"/>
+            <w:u w:val="single"/>
+          </w:rPr>
+          <w:t xml:space="preserve">HAS — Flash Sécurité Patient « Patient sous neuroleptique. La vigilance est la bonne pratique », le document (PDF, 3 pages, daté du 27 octobre 2022) — lu le 21/09/2026</w:t>
+        </w:r>
+      </w:hyperlink>
     </w:p>
     <w:p>
       <w:pPr>
@@ -4163,6 +4371,291 @@
           <w:szCs w:val="22"/>
         </w:rPr>
         <w:t xml:space="preserve">Après avoir exploré les médicaments, la prochaine leçon abordera les approches non médicamenteuses : la réhabilitation psychosociale, le rétablissement (recovery), le rôle des pairs aidants et les interventions qui visent à restaurer les capacités fonctionnelles et la participation sociale des personnes accompagnées.</w:t>
+      </w:r>
+    </w:p>
+    <w:p>
+      <w:pPr>
+        <w:pStyle w:val="Heading2"/>
+        <w:spacing w:after="100" w:before="280"/>
+      </w:pPr>
+      <w:r>
+        <w:rPr>
+          <w:rFonts w:ascii="Times New Roman" w:cs="Times New Roman" w:eastAsia="Times New Roman" w:hAnsi="Times New Roman"/>
+          <w:b/>
+          <w:bCs/>
+          <w:color w:val="1B3A6B"/>
+          <w:sz w:val="28"/>
+          <w:szCs w:val="28"/>
+        </w:rPr>
+        <w:t xml:space="preserve">📝 Journal des corrections (21/09/2026)</w:t>
+      </w:r>
+    </w:p>
+    <w:p>
+      <w:pPr>
+        <w:spacing w:after="40" w:before="40"/>
+      </w:pPr>
+      <w:r>
+        <w:rPr>
+          <w:rFonts w:ascii="Times New Roman" w:cs="Times New Roman" w:eastAsia="Times New Roman" w:hAnsi="Times New Roman"/>
+          <w:i/>
+          <w:iCs/>
+          <w:color w:val="6B7280"/>
+          <w:sz w:val="20"/>
+          <w:szCs w:val="20"/>
+        </w:rPr>
+        <w:t xml:space="preserve">Relecture du 21/09/2026 : sept pages rouvertes avec un agent de navigateur, et le PDF du Flash HAS lu. Les corrections sont intégrées au texte, marquées [Corrigé le 21/09/2026 : …]. Formulations d'origine :</w:t>
+      </w:r>
+    </w:p>
+    <w:p>
+      <w:pPr>
+        <w:pStyle w:val="ListParagraph"/>
+        <w:numPr>
+          <w:ilvl w:val="0"/>
+          <w:numId w:val="1"/>
+        </w:numPr>
+        <w:spacing w:after="40" w:before="40"/>
+      </w:pPr>
+      <w:r>
+        <w:rPr>
+          <w:rFonts w:ascii="Times New Roman" w:cs="Times New Roman" w:eastAsia="Times New Roman" w:hAnsi="Times New Roman"/>
+          <w:i/>
+          <w:iCs/>
+          <w:color w:val="6B7280"/>
+          <w:sz w:val="20"/>
+          <w:szCs w:val="20"/>
+        </w:rPr>
+        <w:t xml:space="preserve">Antidépresseurs : « Quatre sous-classes sont reconnues (ANSM, mis à jour 18/09/2026) » — la page en décrit cinq, la cinquième (« Autres antidépresseurs » : agomélatine, eskétamine, miansérine, mirtazapine, tianeptine, vortioxétine) manquait.</w:t>
+      </w:r>
+    </w:p>
+    <w:p>
+      <w:pPr>
+        <w:pStyle w:val="ListParagraph"/>
+        <w:numPr>
+          <w:ilvl w:val="0"/>
+          <w:numId w:val="1"/>
+        </w:numPr>
+        <w:spacing w:after="40" w:before="40"/>
+      </w:pPr>
+      <w:r>
+        <w:rPr>
+          <w:rFonts w:ascii="Times New Roman" w:cs="Times New Roman" w:eastAsia="Times New Roman" w:hAnsi="Times New Roman"/>
+          <w:i/>
+          <w:iCs/>
+          <w:color w:val="6B7280"/>
+          <w:sz w:val="20"/>
+          <w:szCs w:val="20"/>
+        </w:rPr>
+        <w:t xml:space="preserve">Antidépresseurs : « un syndrome de discontinuation peut survenir » — l'ANSM écrit « syndrome de sevrage ».</w:t>
+      </w:r>
+    </w:p>
+    <w:p>
+      <w:pPr>
+        <w:pStyle w:val="ListParagraph"/>
+        <w:numPr>
+          <w:ilvl w:val="0"/>
+          <w:numId w:val="1"/>
+        </w:numPr>
+        <w:spacing w:after="40" w:before="40"/>
+      </w:pPr>
+      <w:r>
+        <w:rPr>
+          <w:rFonts w:ascii="Times New Roman" w:cs="Times New Roman" w:eastAsia="Times New Roman" w:hAnsi="Times New Roman"/>
+          <w:i/>
+          <w:iCs/>
+          <w:color w:val="6B7280"/>
+          <w:sz w:val="20"/>
+          <w:szCs w:val="20"/>
+        </w:rPr>
+        <w:t xml:space="preserve">Antipsychotiques : « Lévopromazine » (DCI inexistante — lévomépromazine, Nozinan) ; « dyskinésies tardives » là où l'ANSM écrit « dyskinésies ».</w:t>
+      </w:r>
+    </w:p>
+    <w:p>
+      <w:pPr>
+        <w:pStyle w:val="ListParagraph"/>
+        <w:numPr>
+          <w:ilvl w:val="0"/>
+          <w:numId w:val="1"/>
+        </w:numPr>
+        <w:spacing w:after="40" w:before="40"/>
+      </w:pPr>
+      <w:r>
+        <w:rPr>
+          <w:rFonts w:ascii="Times New Roman" w:cs="Times New Roman" w:eastAsia="Times New Roman" w:hAnsi="Times New Roman"/>
+          <w:i/>
+          <w:iCs/>
+          <w:color w:val="6B7280"/>
+          <w:sz w:val="20"/>
+          <w:szCs w:val="20"/>
+        </w:rPr>
+        <w:t xml:space="preserve">Antipsychotiques, « effets indésirables principaux à surveiller en ESSMS » : quatre lignes (extrapyramidal, poids/métabolique, sédation, QT) — ni constipation/occlusion ni fausse route, les deux risques du Flash HAS cité juste en dessous.</w:t>
+      </w:r>
+    </w:p>
+    <w:p>
+      <w:pPr>
+        <w:pStyle w:val="ListParagraph"/>
+        <w:numPr>
+          <w:ilvl w:val="0"/>
+          <w:numId w:val="1"/>
+        </w:numPr>
+        <w:spacing w:after="40" w:before="40"/>
+      </w:pPr>
+      <w:r>
+        <w:rPr>
+          <w:rFonts w:ascii="Times New Roman" w:cs="Times New Roman" w:eastAsia="Times New Roman" w:hAnsi="Times New Roman"/>
+          <w:i/>
+          <w:iCs/>
+          <w:color w:val="6B7280"/>
+          <w:sz w:val="20"/>
+          <w:szCs w:val="20"/>
+        </w:rPr>
+        <w:t xml:space="preserve">Antipsychotiques : « parmi les événements graves médicamenteux liés à un mésusage de neuroleptiques, 1/3 sont liés à une absence d'évaluation régulière » — sans le dénominateur : 60 événements de la base REX-EIGS.</w:t>
+      </w:r>
+    </w:p>
+    <w:p>
+      <w:pPr>
+        <w:pStyle w:val="ListParagraph"/>
+        <w:numPr>
+          <w:ilvl w:val="0"/>
+          <w:numId w:val="1"/>
+        </w:numPr>
+        <w:spacing w:after="40" w:before="40"/>
+      </w:pPr>
+      <w:r>
+        <w:rPr>
+          <w:rFonts w:ascii="Times New Roman" w:cs="Times New Roman" w:eastAsia="Times New Roman" w:hAnsi="Times New Roman"/>
+          <w:i/>
+          <w:iCs/>
+          <w:color w:val="6B7280"/>
+          <w:sz w:val="20"/>
+          <w:szCs w:val="20"/>
+        </w:rPr>
+        <w:t xml:space="preserve">Psychostimulants : « Lisdexamphétamine » — l'ANSM écrit lisdexamfétamine.</w:t>
+      </w:r>
+    </w:p>
+    <w:p>
+      <w:pPr>
+        <w:pStyle w:val="ListParagraph"/>
+        <w:numPr>
+          <w:ilvl w:val="0"/>
+          <w:numId w:val="1"/>
+        </w:numPr>
+        <w:spacing w:after="40" w:before="40"/>
+      </w:pPr>
+      <w:r>
+        <w:rPr>
+          <w:rFonts w:ascii="Times New Roman" w:cs="Times New Roman" w:eastAsia="Times New Roman" w:hAnsi="Times New Roman"/>
+          <w:i/>
+          <w:iCs/>
+          <w:color w:val="6B7280"/>
+          <w:sz w:val="20"/>
+          <w:szCs w:val="20"/>
+        </w:rPr>
+        <w:t xml:space="preserve">Surveillance : « propose quatre actions préventives pour tout professionnel côtoyant des patients sous neuroleptiques » ; action 2 nommée « Détecter » (table et pont pro) — la HAS écrit « Dépister » et s'adresse aux professionnels de santé ; la colonne « ce que cela signifie en pratique » était celle de la leçon.</w:t>
+      </w:r>
+    </w:p>
+    <w:p>
+      <w:pPr>
+        <w:pStyle w:val="ListParagraph"/>
+        <w:numPr>
+          <w:ilvl w:val="0"/>
+          <w:numId w:val="1"/>
+        </w:numPr>
+        <w:spacing w:after="40" w:before="40"/>
+      </w:pPr>
+      <w:r>
+        <w:rPr>
+          <w:rFonts w:ascii="Times New Roman" w:cs="Times New Roman" w:eastAsia="Times New Roman" w:hAnsi="Times New Roman"/>
+          <w:i/>
+          <w:iCs/>
+          <w:color w:val="6B7280"/>
+          <w:sz w:val="20"/>
+          <w:szCs w:val="20"/>
+        </w:rPr>
+        <w:t xml:space="preserve">Corrigé Lucie : « pour la soif, un signal d'alerte possible de lithémie (concentration sanguine) trop élevée » — sur aucune page ouverte.</w:t>
+      </w:r>
+    </w:p>
+    <w:p>
+      <w:pPr>
+        <w:pStyle w:val="ListParagraph"/>
+        <w:numPr>
+          <w:ilvl w:val="0"/>
+          <w:numId w:val="1"/>
+        </w:numPr>
+        <w:spacing w:after="40" w:before="40"/>
+      </w:pPr>
+      <w:r>
+        <w:rPr>
+          <w:rFonts w:ascii="Times New Roman" w:cs="Times New Roman" w:eastAsia="Times New Roman" w:hAnsi="Times New Roman"/>
+          <w:i/>
+          <w:iCs/>
+          <w:color w:val="6B7280"/>
+          <w:sz w:val="20"/>
+          <w:szCs w:val="20"/>
+        </w:rPr>
+        <w:t xml:space="preserve">Corrigé du challenge, ligne Antidépresseur : « Syndrome de discontinuation à l'arrêt ; agitation/irritabilité en début de traitement » — « agitation » n'est dans la théorie que sous les antipsychotiques (akathisie) ; ramené aux termes de la section.</w:t>
+      </w:r>
+    </w:p>
+    <w:p>
+      <w:pPr>
+        <w:pStyle w:val="ListParagraph"/>
+        <w:numPr>
+          <w:ilvl w:val="0"/>
+          <w:numId w:val="1"/>
+        </w:numPr>
+        <w:spacing w:after="40" w:before="40"/>
+      </w:pPr>
+      <w:r>
+        <w:rPr>
+          <w:rFonts w:ascii="Times New Roman" w:cs="Times New Roman" w:eastAsia="Times New Roman" w:hAnsi="Times New Roman"/>
+          <w:i/>
+          <w:iCs/>
+          <w:color w:val="6B7280"/>
+          <w:sz w:val="20"/>
+          <w:szCs w:val="20"/>
+        </w:rPr>
+        <w:t xml:space="preserve">Corrigé du challenge, ligne Thymorégulateur : « Médecin (urgence si fièvre + rigidité + confusion) » — c'est la triade du syndrome malin des neuroleptiques, que le corrigé de l'exercice 2 place chez les antipsychotiques ; ramenée à sa ligne.</w:t>
+      </w:r>
+    </w:p>
+    <w:p>
+      <w:pPr>
+        <w:pStyle w:val="ListParagraph"/>
+        <w:numPr>
+          <w:ilvl w:val="0"/>
+          <w:numId w:val="1"/>
+        </w:numPr>
+        <w:spacing w:after="40" w:before="40"/>
+      </w:pPr>
+      <w:r>
+        <w:rPr>
+          <w:rFonts w:ascii="Times New Roman" w:cs="Times New Roman" w:eastAsia="Times New Roman" w:hAnsi="Times New Roman"/>
+          <w:i/>
+          <w:iCs/>
+          <w:color w:val="6B7280"/>
+          <w:sz w:val="20"/>
+          <w:szCs w:val="20"/>
+        </w:rPr>
+        <w:t xml:space="preserve">Pont pro : « rappelle que 1/3 des événements graves médicamenteux liés aux neuroleptiques sont associés à une absence d'évaluation régulière du traitement. Ce document identifie quatre leviers : informer, détecter, surveiller, sensibiliser » — dénominateur et mésusage perdus, « détecter » pour « dépister », contenu du document absent.</w:t>
+      </w:r>
+    </w:p>
+    <w:p>
+      <w:pPr>
+        <w:pStyle w:val="ListParagraph"/>
+        <w:numPr>
+          <w:ilvl w:val="0"/>
+          <w:numId w:val="1"/>
+        </w:numPr>
+        <w:spacing w:after="40" w:before="40"/>
+      </w:pPr>
+      <w:r>
+        <w:rPr>
+          <w:rFonts w:ascii="Times New Roman" w:cs="Times New Roman" w:eastAsia="Times New Roman" w:hAnsi="Times New Roman"/>
+          <w:i/>
+          <w:iCs/>
+          <w:color w:val="6B7280"/>
+          <w:sz w:val="20"/>
+          <w:szCs w:val="20"/>
+        </w:rPr>
+        <w:t xml:space="preserve">Ressources : la page HAS de présentation seule ; le PDF du Flash (3 pages) n'était ni lu ni lié.</w:t>
       </w:r>
     </w:p>
     <w:sectPr>

</xml_diff>